<commit_message>
Actualizo documentos de planeación (R1, R2, PIP, PDFs) para Program 2
</commit_message>
<xml_diff>
--- a/planning/PipTemplate.docx
+++ b/planning/PipTemplate.docx
@@ -1,6 +1,6 @@
 
 <file path=word/document.xml><?xml version="1.0" encoding="utf-8"?>
-<w:document xmlns:o="urn:schemas-microsoft-com:office:office" xmlns:r="http://schemas.openxmlformats.org/officeDocument/2006/relationships" xmlns:v="urn:schemas-microsoft-com:vml" xmlns:w="http://schemas.openxmlformats.org/wordprocessingml/2006/main" xmlns:w10="urn:schemas-microsoft-com:office:word" xmlns:wp="http://schemas.openxmlformats.org/drawingml/2006/wordprocessingDrawing" xmlns:wps="http://schemas.microsoft.com/office/word/2010/wordprocessingShape" xmlns:wpg="http://schemas.microsoft.com/office/word/2010/wordprocessingGroup" xmlns:mc="http://schemas.openxmlformats.org/markup-compatibility/2006" xmlns:wp14="http://schemas.microsoft.com/office/word/2010/wordprocessingDrawing" xmlns:w14="http://schemas.microsoft.com/office/word/2010/wordml" mc:Ignorable="w14 wp14">
+<w:document xmlns:o="urn:schemas-microsoft-com:office:office" xmlns:r="http://schemas.openxmlformats.org/officeDocument/2006/relationships" xmlns:v="urn:schemas-microsoft-com:vml" xmlns:w="http://schemas.openxmlformats.org/wordprocessingml/2006/main" xmlns:w10="urn:schemas-microsoft-com:office:word" xmlns:wp="http://schemas.openxmlformats.org/drawingml/2006/wordprocessingDrawing" xmlns:wps="http://schemas.microsoft.com/office/word/2010/wordprocessingShape" xmlns:wpg="http://schemas.microsoft.com/office/word/2010/wordprocessingGroup" xmlns:mc="http://schemas.openxmlformats.org/markup-compatibility/2006" xmlns:wp14="http://schemas.microsoft.com/office/word/2010/wordprocessingDrawing" xmlns:w14="http://schemas.microsoft.com/office/word/2010/wordml" xmlns:w15="http://schemas.microsoft.com/office/word/2012/wordml" mc:Ignorable="w14 wp14 w15">
   <w:body>
     <w:p>
       <w:pPr>
@@ -15,12 +15,36 @@
     </w:p>
     <w:p>
       <w:pPr>
-        <w:pStyle w:val="TextBody"/>
-        <w:rPr/>
-      </w:pPr>
-      <w:r>
-        <w:rPr/>
-        <w:t>Nombre: ___________________________________________ Fecha: ____________________________________________ Proyecto: _________________________________________ Versión de PSP: 0.1</w:t>
+        <w:pStyle w:val="BodyText"/>
+        <w:rPr/>
+      </w:pPr>
+      <w:r>
+        <w:rPr/>
+        <w:t>Nombre: _______</w:t>
+      </w:r>
+      <w:r>
+        <w:rPr/>
+        <w:t>Marely Jacome Hernandez</w:t>
+      </w:r>
+      <w:r>
+        <w:rPr/>
+        <w:t>____________________________________ Fecha: ________</w:t>
+      </w:r>
+      <w:r>
+        <w:rPr/>
+        <w:t>5/11/2025</w:t>
+      </w:r>
+      <w:r>
+        <w:rPr/>
+        <w:t>____________________________________ Proyecto: _______</w:t>
+      </w:r>
+      <w:r>
+        <w:rPr/>
+        <w:t>Programa 2 contador de LOC y metodos</w:t>
+      </w:r>
+      <w:r>
+        <w:rPr/>
+        <w:t>__________________________________ Versión de PSP: 0.1</w:t>
       </w:r>
     </w:p>
     <w:p>
@@ -34,7 +58,9 @@
       </w:pPr>
       <w:r>
         <w:rPr/>
-        <w:t>Descripción del Problema ________________________________________________________ ________________________________________________________</w:t>
+        <w:t>Descripción del Problema ___Durante el desarrollo del Programa 1, el proceso no consideraba una forma automatizada de medir el tamaño del código (LOC) ni de identificar la cantidad de métodos, lo que hacía más lenta la recopilación de métricas para el análisis PSP.</w:t>
+        <w:br/>
+        <w:t xml:space="preserve">Además, la revisión del código dependía de conteos manuales propensos a error y sin consistencia entre ejecuciones. </w:t>
       </w:r>
     </w:p>
     <w:p>
@@ -48,7 +74,24 @@
       </w:pPr>
       <w:r>
         <w:rPr/>
-        <w:t>Propuesta de Mejora ________________________________________________________ ________________________________________________________</w:t>
+        <w:t xml:space="preserve">Propuesta de Mejora </w:t>
+      </w:r>
+    </w:p>
+    <w:p>
+      <w:pPr>
+        <w:pStyle w:val="Normal"/>
+        <w:numPr>
+          <w:ilvl w:val="0"/>
+          <w:numId w:val="0"/>
+        </w:numPr>
+        <w:ind w:hanging="0" w:left="720"/>
+        <w:rPr/>
+      </w:pPr>
+      <w:r>
+        <w:rPr/>
+        <w:t>Desarrollar un programa (Program 2) que automatice el conteo de líneas de código (LOC) y métodos dentro de archivos Java, utilizando el mismo esquema de clases del Programa 1 (reciclaje de estructura PSP0.1).</w:t>
+        <w:br/>
+        <w:t>Esto permite mejorar la exactitud, rapidez y consistencia de los datos obtenidos para el registro del tamaño del programa.</w:t>
       </w:r>
     </w:p>
     <w:p>
@@ -62,7 +105,26 @@
       </w:pPr>
       <w:r>
         <w:rPr/>
-        <w:t>Justificación ________________________________________________________ ________________________________________________________</w:t>
+        <w:t>Justificación ________________</w:t>
+      </w:r>
+    </w:p>
+    <w:p>
+      <w:pPr>
+        <w:pStyle w:val="Normal"/>
+        <w:numPr>
+          <w:ilvl w:val="0"/>
+          <w:numId w:val="0"/>
+        </w:numPr>
+        <w:ind w:hanging="0" w:left="720"/>
+        <w:rPr/>
+      </w:pPr>
+      <w:r>
+        <w:rPr/>
+        <w:t>El conteo automatizado elimina el error humano y acelera el registro de datos necesarios en el proceso PSP.</w:t>
+        <w:br/>
+        <w:t>La mejora permite integrar el cálculo de LOC y métodos dentro del mismo flujo usado en Program 1, fortaleciendo la trazabilidad entre el tamaño del programa y los tiempos de desarrollo registrados.</w:t>
+        <w:br/>
+        <w:t>Además, el uso de código reciclado favorece la reutilización y reduce el tiempo de diseño.</w:t>
       </w:r>
     </w:p>
     <w:p>
@@ -76,7 +138,190 @@
       </w:pPr>
       <w:r>
         <w:rPr/>
-        <w:t>Plan de Implementación ________________________________________________________ ________________________________________________________</w:t>
+        <w:t xml:space="preserve">Plan de Implementación </w:t>
+      </w:r>
+    </w:p>
+    <w:p>
+      <w:pPr>
+        <w:pStyle w:val="BodyText"/>
+        <w:numPr>
+          <w:ilvl w:val="0"/>
+          <w:numId w:val="7"/>
+        </w:numPr>
+        <w:rPr/>
+      </w:pPr>
+      <w:r>
+        <w:rPr/>
+        <w:t xml:space="preserve">Crear una nueva rama </w:t>
+      </w:r>
+      <w:r>
+        <w:rPr>
+          <w:rStyle w:val="Textooriginal"/>
+        </w:rPr>
+        <w:t>code</w:t>
+      </w:r>
+      <w:r>
+        <w:rPr/>
+        <w:t xml:space="preserve"> derivada de </w:t>
+      </w:r>
+      <w:r>
+        <w:rPr>
+          <w:rStyle w:val="Textooriginal"/>
+        </w:rPr>
+        <w:t>develop</w:t>
+      </w:r>
+      <w:r>
+        <w:rPr/>
+        <w:t>.</w:t>
+      </w:r>
+    </w:p>
+    <w:p>
+      <w:pPr>
+        <w:pStyle w:val="BodyText"/>
+        <w:numPr>
+          <w:ilvl w:val="0"/>
+          <w:numId w:val="2"/>
+        </w:numPr>
+        <w:tabs>
+          <w:tab w:val="clear" w:pos="720"/>
+          <w:tab w:val="left" w:pos="0" w:leader="none"/>
+        </w:tabs>
+        <w:ind w:hanging="283" w:left="720"/>
+        <w:rPr/>
+      </w:pPr>
+      <w:r>
+        <w:rPr/>
+        <w:t>Reciclar las clases del Programa 1 (App, Logic, Input, Data, OutPut).</w:t>
+      </w:r>
+    </w:p>
+    <w:p>
+      <w:pPr>
+        <w:pStyle w:val="BodyText"/>
+        <w:numPr>
+          <w:ilvl w:val="0"/>
+          <w:numId w:val="3"/>
+        </w:numPr>
+        <w:tabs>
+          <w:tab w:val="clear" w:pos="720"/>
+          <w:tab w:val="left" w:pos="0" w:leader="none"/>
+        </w:tabs>
+        <w:ind w:hanging="283" w:left="720"/>
+        <w:rPr/>
+      </w:pPr>
+      <w:r>
+        <w:rPr/>
+        <w:t xml:space="preserve">Agregar las clases </w:t>
+      </w:r>
+      <w:r>
+        <w:rPr>
+          <w:rStyle w:val="Textooriginal"/>
+        </w:rPr>
+        <w:t>lineCounter</w:t>
+      </w:r>
+      <w:r>
+        <w:rPr/>
+        <w:t xml:space="preserve"> y </w:t>
+      </w:r>
+      <w:r>
+        <w:rPr>
+          <w:rStyle w:val="Textooriginal"/>
+        </w:rPr>
+        <w:t>MethodCounter</w:t>
+      </w:r>
+      <w:r>
+        <w:rPr/>
+        <w:t xml:space="preserve"> con lógica para conteo automático.</w:t>
+      </w:r>
+    </w:p>
+    <w:p>
+      <w:pPr>
+        <w:pStyle w:val="BodyText"/>
+        <w:numPr>
+          <w:ilvl w:val="0"/>
+          <w:numId w:val="4"/>
+        </w:numPr>
+        <w:tabs>
+          <w:tab w:val="clear" w:pos="720"/>
+          <w:tab w:val="left" w:pos="0" w:leader="none"/>
+        </w:tabs>
+        <w:ind w:hanging="283" w:left="720"/>
+        <w:rPr/>
+      </w:pPr>
+      <w:r>
+        <w:rPr/>
+        <w:t>Probar con archivos Java de ejemplo (</w:t>
+      </w:r>
+      <w:r>
+        <w:rPr>
+          <w:rStyle w:val="Textooriginal"/>
+        </w:rPr>
+        <w:t>App.java</w:t>
+      </w:r>
+      <w:r>
+        <w:rPr/>
+        <w:t xml:space="preserve">, </w:t>
+      </w:r>
+      <w:r>
+        <w:rPr>
+          <w:rStyle w:val="Textooriginal"/>
+        </w:rPr>
+        <w:t>Logic2.java</w:t>
+      </w:r>
+      <w:r>
+        <w:rPr/>
+        <w:t>).</w:t>
+      </w:r>
+    </w:p>
+    <w:p>
+      <w:pPr>
+        <w:pStyle w:val="BodyText"/>
+        <w:numPr>
+          <w:ilvl w:val="0"/>
+          <w:numId w:val="5"/>
+        </w:numPr>
+        <w:tabs>
+          <w:tab w:val="clear" w:pos="720"/>
+          <w:tab w:val="left" w:pos="0" w:leader="none"/>
+        </w:tabs>
+        <w:ind w:hanging="283" w:left="720"/>
+        <w:rPr/>
+      </w:pPr>
+      <w:r>
+        <w:rPr/>
+        <w:t>Registrar tiempos y defectos en las bitácoras PSP.</w:t>
+      </w:r>
+    </w:p>
+    <w:p>
+      <w:pPr>
+        <w:pStyle w:val="BodyText"/>
+        <w:numPr>
+          <w:ilvl w:val="0"/>
+          <w:numId w:val="6"/>
+        </w:numPr>
+        <w:tabs>
+          <w:tab w:val="clear" w:pos="720"/>
+          <w:tab w:val="left" w:pos="0" w:leader="none"/>
+        </w:tabs>
+        <w:ind w:hanging="283" w:left="720"/>
+        <w:rPr/>
+      </w:pPr>
+      <w:r>
+        <w:rPr/>
+        <w:t>Integrar resultados de prueba en los reportes del Programa 2.</w:t>
+      </w:r>
+    </w:p>
+    <w:p>
+      <w:pPr>
+        <w:pStyle w:val="Normal"/>
+        <w:numPr>
+          <w:ilvl w:val="0"/>
+          <w:numId w:val="0"/>
+        </w:numPr>
+        <w:ind w:hanging="0" w:left="720"/>
+        <w:rPr/>
+      </w:pPr>
+      <w:r>
+        <w:rPr/>
       </w:r>
     </w:p>
     <w:p>
@@ -90,23 +335,44 @@
       </w:pPr>
       <w:r>
         <w:rPr/>
-        <w:t>Resultados Esperados ________________________________________________________ ________________________________________________________</w:t>
+        <w:t xml:space="preserve">Resultados Esperados </w:t>
       </w:r>
     </w:p>
     <w:p>
       <w:pPr>
         <w:pStyle w:val="Normal"/>
+        <w:numPr>
+          <w:ilvl w:val="0"/>
+          <w:numId w:val="0"/>
+        </w:numPr>
+        <w:ind w:hanging="0" w:left="720"/>
+        <w:rPr/>
+      </w:pPr>
+      <w:r>
+        <w:rPr/>
+        <w:t xml:space="preserve">Que el programa cuente correctamente los LOC y los Metodos de cualquier programa Java. </w:t>
+      </w:r>
+    </w:p>
+    <w:p>
+      <w:pPr>
+        <w:pStyle w:val="Normal"/>
+        <w:numPr>
+          <w:ilvl w:val="0"/>
+          <w:numId w:val="0"/>
+        </w:numPr>
         <w:spacing w:before="0" w:after="200"/>
-        <w:rPr/>
-      </w:pPr>
-      <w:r>
-        <w:rPr/>
+        <w:ind w:hanging="0" w:left="720"/>
+        <w:rPr/>
+      </w:pPr>
+      <w:r>
+        <w:rPr/>
+        <w:t>Que promueva la rutilizacion de codigo.</w:t>
       </w:r>
     </w:p>
     <w:sectPr>
       <w:type w:val="nextPage"/>
       <w:pgSz w:w="12240" w:h="15840"/>
-      <w:pgMar w:left="1800" w:right="1800" w:header="0" w:top="1440" w:footer="0" w:bottom="1440" w:gutter="0"/>
+      <w:pgMar w:left="1800" w:right="1800" w:gutter="0" w:header="0" w:top="1440" w:footer="0" w:bottom="1440"/>
       <w:pgNumType w:fmt="decimal"/>
       <w:formProt w:val="false"/>
       <w:textDirection w:val="lrTb"/>
@@ -117,7 +383,7 @@
 </file>
 
 <file path=word/numbering.xml><?xml version="1.0" encoding="utf-8"?>
-<w:numbering xmlns:w="http://schemas.openxmlformats.org/wordprocessingml/2006/main" xmlns:o="urn:schemas-microsoft-com:office:office" xmlns:r="http://schemas.openxmlformats.org/officeDocument/2006/relationships" xmlns:v="urn:schemas-microsoft-com:vml">
+<w:numbering xmlns:w="http://schemas.openxmlformats.org/wordprocessingml/2006/main" xmlns:o="urn:schemas-microsoft-com:office:office" xmlns:r="http://schemas.openxmlformats.org/officeDocument/2006/relationships" xmlns:v="urn:schemas-microsoft-com:vml" xmlns:mc="http://schemas.openxmlformats.org/markup-compatibility/2006" xmlns:w14="http://schemas.microsoft.com/office/word/2010/wordml" mc:Ignorable="w14">
   <w:abstractNum w:abstractNumId="1">
     <w:lvl w:ilvl="0">
       <w:start w:val="1"/>
@@ -125,8 +391,12 @@
       <w:lvlText w:val="%1."/>
       <w:lvlJc w:val="left"/>
       <w:pPr>
+        <w:tabs>
+          <w:tab w:val="num" w:pos="0"/>
+        </w:tabs>
         <w:ind w:left="720" w:hanging="360"/>
       </w:pPr>
+      <w:rPr/>
     </w:lvl>
     <w:lvl w:ilvl="1">
       <w:start w:val="1"/>
@@ -134,8 +404,12 @@
       <w:lvlText w:val="%2."/>
       <w:lvlJc w:val="left"/>
       <w:pPr>
+        <w:tabs>
+          <w:tab w:val="num" w:pos="0"/>
+        </w:tabs>
         <w:ind w:left="1440" w:hanging="360"/>
       </w:pPr>
+      <w:rPr/>
     </w:lvl>
     <w:lvl w:ilvl="2">
       <w:start w:val="1"/>
@@ -143,8 +417,12 @@
       <w:lvlText w:val="%3."/>
       <w:lvlJc w:val="left"/>
       <w:pPr>
+        <w:tabs>
+          <w:tab w:val="num" w:pos="0"/>
+        </w:tabs>
         <w:ind w:left="2160" w:hanging="360"/>
       </w:pPr>
+      <w:rPr/>
     </w:lvl>
     <w:lvl w:ilvl="3">
       <w:start w:val="1"/>
@@ -152,8 +430,12 @@
       <w:lvlText w:val="%4."/>
       <w:lvlJc w:val="left"/>
       <w:pPr>
+        <w:tabs>
+          <w:tab w:val="num" w:pos="0"/>
+        </w:tabs>
         <w:ind w:left="2880" w:hanging="360"/>
       </w:pPr>
+      <w:rPr/>
     </w:lvl>
     <w:lvl w:ilvl="4">
       <w:start w:val="1"/>
@@ -161,8 +443,12 @@
       <w:lvlText w:val="%5."/>
       <w:lvlJc w:val="left"/>
       <w:pPr>
+        <w:tabs>
+          <w:tab w:val="num" w:pos="0"/>
+        </w:tabs>
         <w:ind w:left="3600" w:hanging="360"/>
       </w:pPr>
+      <w:rPr/>
     </w:lvl>
     <w:lvl w:ilvl="5">
       <w:start w:val="1"/>
@@ -170,8 +456,12 @@
       <w:lvlText w:val="%6."/>
       <w:lvlJc w:val="left"/>
       <w:pPr>
+        <w:tabs>
+          <w:tab w:val="num" w:pos="0"/>
+        </w:tabs>
         <w:ind w:left="4320" w:hanging="360"/>
       </w:pPr>
+      <w:rPr/>
     </w:lvl>
     <w:lvl w:ilvl="6">
       <w:start w:val="1"/>
@@ -179,8 +469,12 @@
       <w:lvlText w:val="%7."/>
       <w:lvlJc w:val="left"/>
       <w:pPr>
+        <w:tabs>
+          <w:tab w:val="num" w:pos="0"/>
+        </w:tabs>
         <w:ind w:left="5040" w:hanging="360"/>
       </w:pPr>
+      <w:rPr/>
     </w:lvl>
     <w:lvl w:ilvl="7">
       <w:start w:val="1"/>
@@ -188,8 +482,12 @@
       <w:lvlText w:val="%8."/>
       <w:lvlJc w:val="left"/>
       <w:pPr>
+        <w:tabs>
+          <w:tab w:val="num" w:pos="0"/>
+        </w:tabs>
         <w:ind w:left="5760" w:hanging="360"/>
       </w:pPr>
+      <w:rPr/>
     </w:lvl>
     <w:lvl w:ilvl="8">
       <w:start w:val="1"/>
@@ -197,18 +495,727 @@
       <w:lvlText w:val="%9."/>
       <w:lvlJc w:val="left"/>
       <w:pPr>
+        <w:tabs>
+          <w:tab w:val="num" w:pos="0"/>
+        </w:tabs>
         <w:ind w:left="6480" w:hanging="360"/>
       </w:pPr>
+      <w:rPr/>
     </w:lvl>
   </w:abstractNum>
   <w:abstractNum w:abstractNumId="2">
     <w:lvl w:ilvl="0">
       <w:start w:val="1"/>
+      <w:numFmt w:val="bullet"/>
+      <w:lvlText w:val=""/>
+      <w:lvlJc w:val="left"/>
+      <w:pPr>
+        <w:tabs>
+          <w:tab w:val="num" w:pos="720"/>
+        </w:tabs>
+        <w:ind w:left="720" w:hanging="283"/>
+      </w:pPr>
+      <w:rPr>
+        <w:rFonts w:ascii="Symbol" w:hAnsi="Symbol" w:cs="Symbol" w:hint="default"/>
+      </w:rPr>
+    </w:lvl>
+    <w:lvl w:ilvl="1">
+      <w:start w:val="1"/>
+      <w:numFmt w:val="decimal"/>
+      <w:lvlText w:val="%2."/>
+      <w:lvlJc w:val="left"/>
+      <w:pPr>
+        <w:tabs>
+          <w:tab w:val="num" w:pos="1080"/>
+        </w:tabs>
+        <w:ind w:left="1080" w:hanging="360"/>
+      </w:pPr>
+    </w:lvl>
+    <w:lvl w:ilvl="2">
+      <w:start w:val="1"/>
+      <w:numFmt w:val="decimal"/>
+      <w:lvlText w:val="%3."/>
+      <w:lvlJc w:val="left"/>
+      <w:pPr>
+        <w:tabs>
+          <w:tab w:val="num" w:pos="1440"/>
+        </w:tabs>
+        <w:ind w:left="1440" w:hanging="360"/>
+      </w:pPr>
+    </w:lvl>
+    <w:lvl w:ilvl="3">
+      <w:start w:val="1"/>
+      <w:numFmt w:val="decimal"/>
+      <w:lvlText w:val="%4."/>
+      <w:lvlJc w:val="left"/>
+      <w:pPr>
+        <w:tabs>
+          <w:tab w:val="num" w:pos="1800"/>
+        </w:tabs>
+        <w:ind w:left="1800" w:hanging="360"/>
+      </w:pPr>
+    </w:lvl>
+    <w:lvl w:ilvl="4">
+      <w:start w:val="1"/>
+      <w:numFmt w:val="decimal"/>
+      <w:lvlText w:val="%5."/>
+      <w:lvlJc w:val="left"/>
+      <w:pPr>
+        <w:tabs>
+          <w:tab w:val="num" w:pos="2160"/>
+        </w:tabs>
+        <w:ind w:left="2160" w:hanging="360"/>
+      </w:pPr>
+    </w:lvl>
+    <w:lvl w:ilvl="5">
+      <w:start w:val="1"/>
+      <w:numFmt w:val="decimal"/>
+      <w:lvlText w:val="%6."/>
+      <w:lvlJc w:val="left"/>
+      <w:pPr>
+        <w:tabs>
+          <w:tab w:val="num" w:pos="2520"/>
+        </w:tabs>
+        <w:ind w:left="2520" w:hanging="360"/>
+      </w:pPr>
+    </w:lvl>
+    <w:lvl w:ilvl="6">
+      <w:start w:val="1"/>
+      <w:numFmt w:val="decimal"/>
+      <w:lvlText w:val="%7."/>
+      <w:lvlJc w:val="left"/>
+      <w:pPr>
+        <w:tabs>
+          <w:tab w:val="num" w:pos="2880"/>
+        </w:tabs>
+        <w:ind w:left="2880" w:hanging="360"/>
+      </w:pPr>
+    </w:lvl>
+    <w:lvl w:ilvl="7">
+      <w:start w:val="1"/>
+      <w:numFmt w:val="decimal"/>
+      <w:lvlText w:val="%8."/>
+      <w:lvlJc w:val="left"/>
+      <w:pPr>
+        <w:tabs>
+          <w:tab w:val="num" w:pos="3240"/>
+        </w:tabs>
+        <w:ind w:left="3240" w:hanging="360"/>
+      </w:pPr>
+    </w:lvl>
+    <w:lvl w:ilvl="8">
+      <w:start w:val="1"/>
+      <w:numFmt w:val="decimal"/>
+      <w:lvlText w:val="%9."/>
+      <w:lvlJc w:val="left"/>
+      <w:pPr>
+        <w:tabs>
+          <w:tab w:val="num" w:pos="3600"/>
+        </w:tabs>
+        <w:ind w:left="3600" w:hanging="360"/>
+      </w:pPr>
+    </w:lvl>
+  </w:abstractNum>
+  <w:abstractNum w:abstractNumId="3">
+    <w:lvl w:ilvl="0">
+      <w:start w:val="1"/>
+      <w:numFmt w:val="bullet"/>
+      <w:lvlText w:val=""/>
+      <w:lvlJc w:val="left"/>
+      <w:pPr>
+        <w:tabs>
+          <w:tab w:val="num" w:pos="720"/>
+        </w:tabs>
+        <w:ind w:left="720" w:hanging="283"/>
+      </w:pPr>
+      <w:rPr>
+        <w:rFonts w:ascii="Symbol" w:hAnsi="Symbol" w:cs="Symbol" w:hint="default"/>
+      </w:rPr>
+    </w:lvl>
+    <w:lvl w:ilvl="1">
+      <w:start w:val="1"/>
+      <w:numFmt w:val="decimal"/>
+      <w:lvlText w:val="%2."/>
+      <w:lvlJc w:val="left"/>
+      <w:pPr>
+        <w:tabs>
+          <w:tab w:val="num" w:pos="1080"/>
+        </w:tabs>
+        <w:ind w:left="1080" w:hanging="360"/>
+      </w:pPr>
+    </w:lvl>
+    <w:lvl w:ilvl="2">
+      <w:start w:val="1"/>
+      <w:numFmt w:val="decimal"/>
+      <w:lvlText w:val="%3."/>
+      <w:lvlJc w:val="left"/>
+      <w:pPr>
+        <w:tabs>
+          <w:tab w:val="num" w:pos="1440"/>
+        </w:tabs>
+        <w:ind w:left="1440" w:hanging="360"/>
+      </w:pPr>
+    </w:lvl>
+    <w:lvl w:ilvl="3">
+      <w:start w:val="1"/>
+      <w:numFmt w:val="decimal"/>
+      <w:lvlText w:val="%4."/>
+      <w:lvlJc w:val="left"/>
+      <w:pPr>
+        <w:tabs>
+          <w:tab w:val="num" w:pos="1800"/>
+        </w:tabs>
+        <w:ind w:left="1800" w:hanging="360"/>
+      </w:pPr>
+    </w:lvl>
+    <w:lvl w:ilvl="4">
+      <w:start w:val="1"/>
+      <w:numFmt w:val="decimal"/>
+      <w:lvlText w:val="%5."/>
+      <w:lvlJc w:val="left"/>
+      <w:pPr>
+        <w:tabs>
+          <w:tab w:val="num" w:pos="2160"/>
+        </w:tabs>
+        <w:ind w:left="2160" w:hanging="360"/>
+      </w:pPr>
+    </w:lvl>
+    <w:lvl w:ilvl="5">
+      <w:start w:val="1"/>
+      <w:numFmt w:val="decimal"/>
+      <w:lvlText w:val="%6."/>
+      <w:lvlJc w:val="left"/>
+      <w:pPr>
+        <w:tabs>
+          <w:tab w:val="num" w:pos="2520"/>
+        </w:tabs>
+        <w:ind w:left="2520" w:hanging="360"/>
+      </w:pPr>
+    </w:lvl>
+    <w:lvl w:ilvl="6">
+      <w:start w:val="1"/>
+      <w:numFmt w:val="decimal"/>
+      <w:lvlText w:val="%7."/>
+      <w:lvlJc w:val="left"/>
+      <w:pPr>
+        <w:tabs>
+          <w:tab w:val="num" w:pos="2880"/>
+        </w:tabs>
+        <w:ind w:left="2880" w:hanging="360"/>
+      </w:pPr>
+    </w:lvl>
+    <w:lvl w:ilvl="7">
+      <w:start w:val="1"/>
+      <w:numFmt w:val="decimal"/>
+      <w:lvlText w:val="%8."/>
+      <w:lvlJc w:val="left"/>
+      <w:pPr>
+        <w:tabs>
+          <w:tab w:val="num" w:pos="3240"/>
+        </w:tabs>
+        <w:ind w:left="3240" w:hanging="360"/>
+      </w:pPr>
+    </w:lvl>
+    <w:lvl w:ilvl="8">
+      <w:start w:val="1"/>
+      <w:numFmt w:val="decimal"/>
+      <w:lvlText w:val="%9."/>
+      <w:lvlJc w:val="left"/>
+      <w:pPr>
+        <w:tabs>
+          <w:tab w:val="num" w:pos="3600"/>
+        </w:tabs>
+        <w:ind w:left="3600" w:hanging="360"/>
+      </w:pPr>
+    </w:lvl>
+  </w:abstractNum>
+  <w:abstractNum w:abstractNumId="4">
+    <w:lvl w:ilvl="0">
+      <w:start w:val="1"/>
+      <w:numFmt w:val="bullet"/>
+      <w:lvlText w:val=""/>
+      <w:lvlJc w:val="left"/>
+      <w:pPr>
+        <w:tabs>
+          <w:tab w:val="num" w:pos="720"/>
+        </w:tabs>
+        <w:ind w:left="720" w:hanging="283"/>
+      </w:pPr>
+      <w:rPr>
+        <w:rFonts w:ascii="Symbol" w:hAnsi="Symbol" w:cs="Symbol" w:hint="default"/>
+      </w:rPr>
+    </w:lvl>
+    <w:lvl w:ilvl="1">
+      <w:start w:val="1"/>
+      <w:numFmt w:val="decimal"/>
+      <w:lvlText w:val="%2."/>
+      <w:lvlJc w:val="left"/>
+      <w:pPr>
+        <w:tabs>
+          <w:tab w:val="num" w:pos="1080"/>
+        </w:tabs>
+        <w:ind w:left="1080" w:hanging="360"/>
+      </w:pPr>
+    </w:lvl>
+    <w:lvl w:ilvl="2">
+      <w:start w:val="1"/>
+      <w:numFmt w:val="decimal"/>
+      <w:lvlText w:val="%3."/>
+      <w:lvlJc w:val="left"/>
+      <w:pPr>
+        <w:tabs>
+          <w:tab w:val="num" w:pos="1440"/>
+        </w:tabs>
+        <w:ind w:left="1440" w:hanging="360"/>
+      </w:pPr>
+    </w:lvl>
+    <w:lvl w:ilvl="3">
+      <w:start w:val="1"/>
+      <w:numFmt w:val="decimal"/>
+      <w:lvlText w:val="%4."/>
+      <w:lvlJc w:val="left"/>
+      <w:pPr>
+        <w:tabs>
+          <w:tab w:val="num" w:pos="1800"/>
+        </w:tabs>
+        <w:ind w:left="1800" w:hanging="360"/>
+      </w:pPr>
+    </w:lvl>
+    <w:lvl w:ilvl="4">
+      <w:start w:val="1"/>
+      <w:numFmt w:val="decimal"/>
+      <w:lvlText w:val="%5."/>
+      <w:lvlJc w:val="left"/>
+      <w:pPr>
+        <w:tabs>
+          <w:tab w:val="num" w:pos="2160"/>
+        </w:tabs>
+        <w:ind w:left="2160" w:hanging="360"/>
+      </w:pPr>
+    </w:lvl>
+    <w:lvl w:ilvl="5">
+      <w:start w:val="1"/>
+      <w:numFmt w:val="decimal"/>
+      <w:lvlText w:val="%6."/>
+      <w:lvlJc w:val="left"/>
+      <w:pPr>
+        <w:tabs>
+          <w:tab w:val="num" w:pos="2520"/>
+        </w:tabs>
+        <w:ind w:left="2520" w:hanging="360"/>
+      </w:pPr>
+    </w:lvl>
+    <w:lvl w:ilvl="6">
+      <w:start w:val="1"/>
+      <w:numFmt w:val="decimal"/>
+      <w:lvlText w:val="%7."/>
+      <w:lvlJc w:val="left"/>
+      <w:pPr>
+        <w:tabs>
+          <w:tab w:val="num" w:pos="2880"/>
+        </w:tabs>
+        <w:ind w:left="2880" w:hanging="360"/>
+      </w:pPr>
+    </w:lvl>
+    <w:lvl w:ilvl="7">
+      <w:start w:val="1"/>
+      <w:numFmt w:val="decimal"/>
+      <w:lvlText w:val="%8."/>
+      <w:lvlJc w:val="left"/>
+      <w:pPr>
+        <w:tabs>
+          <w:tab w:val="num" w:pos="3240"/>
+        </w:tabs>
+        <w:ind w:left="3240" w:hanging="360"/>
+      </w:pPr>
+    </w:lvl>
+    <w:lvl w:ilvl="8">
+      <w:start w:val="1"/>
+      <w:numFmt w:val="decimal"/>
+      <w:lvlText w:val="%9."/>
+      <w:lvlJc w:val="left"/>
+      <w:pPr>
+        <w:tabs>
+          <w:tab w:val="num" w:pos="3600"/>
+        </w:tabs>
+        <w:ind w:left="3600" w:hanging="360"/>
+      </w:pPr>
+    </w:lvl>
+  </w:abstractNum>
+  <w:abstractNum w:abstractNumId="5">
+    <w:lvl w:ilvl="0">
+      <w:start w:val="1"/>
+      <w:numFmt w:val="bullet"/>
+      <w:lvlText w:val=""/>
+      <w:lvlJc w:val="left"/>
+      <w:pPr>
+        <w:tabs>
+          <w:tab w:val="num" w:pos="720"/>
+        </w:tabs>
+        <w:ind w:left="720" w:hanging="283"/>
+      </w:pPr>
+      <w:rPr>
+        <w:rFonts w:ascii="Symbol" w:hAnsi="Symbol" w:cs="Symbol" w:hint="default"/>
+      </w:rPr>
+    </w:lvl>
+    <w:lvl w:ilvl="1">
+      <w:start w:val="1"/>
+      <w:numFmt w:val="decimal"/>
+      <w:lvlText w:val="%2."/>
+      <w:lvlJc w:val="left"/>
+      <w:pPr>
+        <w:tabs>
+          <w:tab w:val="num" w:pos="1080"/>
+        </w:tabs>
+        <w:ind w:left="1080" w:hanging="360"/>
+      </w:pPr>
+    </w:lvl>
+    <w:lvl w:ilvl="2">
+      <w:start w:val="1"/>
+      <w:numFmt w:val="decimal"/>
+      <w:lvlText w:val="%3."/>
+      <w:lvlJc w:val="left"/>
+      <w:pPr>
+        <w:tabs>
+          <w:tab w:val="num" w:pos="1440"/>
+        </w:tabs>
+        <w:ind w:left="1440" w:hanging="360"/>
+      </w:pPr>
+    </w:lvl>
+    <w:lvl w:ilvl="3">
+      <w:start w:val="1"/>
+      <w:numFmt w:val="decimal"/>
+      <w:lvlText w:val="%4."/>
+      <w:lvlJc w:val="left"/>
+      <w:pPr>
+        <w:tabs>
+          <w:tab w:val="num" w:pos="1800"/>
+        </w:tabs>
+        <w:ind w:left="1800" w:hanging="360"/>
+      </w:pPr>
+    </w:lvl>
+    <w:lvl w:ilvl="4">
+      <w:start w:val="1"/>
+      <w:numFmt w:val="decimal"/>
+      <w:lvlText w:val="%5."/>
+      <w:lvlJc w:val="left"/>
+      <w:pPr>
+        <w:tabs>
+          <w:tab w:val="num" w:pos="2160"/>
+        </w:tabs>
+        <w:ind w:left="2160" w:hanging="360"/>
+      </w:pPr>
+    </w:lvl>
+    <w:lvl w:ilvl="5">
+      <w:start w:val="1"/>
+      <w:numFmt w:val="decimal"/>
+      <w:lvlText w:val="%6."/>
+      <w:lvlJc w:val="left"/>
+      <w:pPr>
+        <w:tabs>
+          <w:tab w:val="num" w:pos="2520"/>
+        </w:tabs>
+        <w:ind w:left="2520" w:hanging="360"/>
+      </w:pPr>
+    </w:lvl>
+    <w:lvl w:ilvl="6">
+      <w:start w:val="1"/>
+      <w:numFmt w:val="decimal"/>
+      <w:lvlText w:val="%7."/>
+      <w:lvlJc w:val="left"/>
+      <w:pPr>
+        <w:tabs>
+          <w:tab w:val="num" w:pos="2880"/>
+        </w:tabs>
+        <w:ind w:left="2880" w:hanging="360"/>
+      </w:pPr>
+    </w:lvl>
+    <w:lvl w:ilvl="7">
+      <w:start w:val="1"/>
+      <w:numFmt w:val="decimal"/>
+      <w:lvlText w:val="%8."/>
+      <w:lvlJc w:val="left"/>
+      <w:pPr>
+        <w:tabs>
+          <w:tab w:val="num" w:pos="3240"/>
+        </w:tabs>
+        <w:ind w:left="3240" w:hanging="360"/>
+      </w:pPr>
+    </w:lvl>
+    <w:lvl w:ilvl="8">
+      <w:start w:val="1"/>
+      <w:numFmt w:val="decimal"/>
+      <w:lvlText w:val="%9."/>
+      <w:lvlJc w:val="left"/>
+      <w:pPr>
+        <w:tabs>
+          <w:tab w:val="num" w:pos="3600"/>
+        </w:tabs>
+        <w:ind w:left="3600" w:hanging="360"/>
+      </w:pPr>
+    </w:lvl>
+  </w:abstractNum>
+  <w:abstractNum w:abstractNumId="6">
+    <w:lvl w:ilvl="0">
+      <w:start w:val="1"/>
+      <w:numFmt w:val="bullet"/>
+      <w:lvlText w:val=""/>
+      <w:lvlJc w:val="left"/>
+      <w:pPr>
+        <w:tabs>
+          <w:tab w:val="num" w:pos="720"/>
+        </w:tabs>
+        <w:ind w:left="720" w:hanging="283"/>
+      </w:pPr>
+      <w:rPr>
+        <w:rFonts w:ascii="Symbol" w:hAnsi="Symbol" w:cs="Symbol" w:hint="default"/>
+      </w:rPr>
+    </w:lvl>
+    <w:lvl w:ilvl="1">
+      <w:start w:val="1"/>
+      <w:numFmt w:val="decimal"/>
+      <w:lvlText w:val="%2."/>
+      <w:lvlJc w:val="left"/>
+      <w:pPr>
+        <w:tabs>
+          <w:tab w:val="num" w:pos="1080"/>
+        </w:tabs>
+        <w:ind w:left="1080" w:hanging="360"/>
+      </w:pPr>
+    </w:lvl>
+    <w:lvl w:ilvl="2">
+      <w:start w:val="1"/>
+      <w:numFmt w:val="decimal"/>
+      <w:lvlText w:val="%3."/>
+      <w:lvlJc w:val="left"/>
+      <w:pPr>
+        <w:tabs>
+          <w:tab w:val="num" w:pos="1440"/>
+        </w:tabs>
+        <w:ind w:left="1440" w:hanging="360"/>
+      </w:pPr>
+    </w:lvl>
+    <w:lvl w:ilvl="3">
+      <w:start w:val="1"/>
+      <w:numFmt w:val="decimal"/>
+      <w:lvlText w:val="%4."/>
+      <w:lvlJc w:val="left"/>
+      <w:pPr>
+        <w:tabs>
+          <w:tab w:val="num" w:pos="1800"/>
+        </w:tabs>
+        <w:ind w:left="1800" w:hanging="360"/>
+      </w:pPr>
+    </w:lvl>
+    <w:lvl w:ilvl="4">
+      <w:start w:val="1"/>
+      <w:numFmt w:val="decimal"/>
+      <w:lvlText w:val="%5."/>
+      <w:lvlJc w:val="left"/>
+      <w:pPr>
+        <w:tabs>
+          <w:tab w:val="num" w:pos="2160"/>
+        </w:tabs>
+        <w:ind w:left="2160" w:hanging="360"/>
+      </w:pPr>
+    </w:lvl>
+    <w:lvl w:ilvl="5">
+      <w:start w:val="1"/>
+      <w:numFmt w:val="decimal"/>
+      <w:lvlText w:val="%6."/>
+      <w:lvlJc w:val="left"/>
+      <w:pPr>
+        <w:tabs>
+          <w:tab w:val="num" w:pos="2520"/>
+        </w:tabs>
+        <w:ind w:left="2520" w:hanging="360"/>
+      </w:pPr>
+    </w:lvl>
+    <w:lvl w:ilvl="6">
+      <w:start w:val="1"/>
+      <w:numFmt w:val="decimal"/>
+      <w:lvlText w:val="%7."/>
+      <w:lvlJc w:val="left"/>
+      <w:pPr>
+        <w:tabs>
+          <w:tab w:val="num" w:pos="2880"/>
+        </w:tabs>
+        <w:ind w:left="2880" w:hanging="360"/>
+      </w:pPr>
+    </w:lvl>
+    <w:lvl w:ilvl="7">
+      <w:start w:val="1"/>
+      <w:numFmt w:val="decimal"/>
+      <w:lvlText w:val="%8."/>
+      <w:lvlJc w:val="left"/>
+      <w:pPr>
+        <w:tabs>
+          <w:tab w:val="num" w:pos="3240"/>
+        </w:tabs>
+        <w:ind w:left="3240" w:hanging="360"/>
+      </w:pPr>
+    </w:lvl>
+    <w:lvl w:ilvl="8">
+      <w:start w:val="1"/>
+      <w:numFmt w:val="decimal"/>
+      <w:lvlText w:val="%9."/>
+      <w:lvlJc w:val="left"/>
+      <w:pPr>
+        <w:tabs>
+          <w:tab w:val="num" w:pos="3600"/>
+        </w:tabs>
+        <w:ind w:left="3600" w:hanging="360"/>
+      </w:pPr>
+    </w:lvl>
+  </w:abstractNum>
+  <w:abstractNum w:abstractNumId="7">
+    <w:lvl w:ilvl="0">
+      <w:start w:val="1"/>
+      <w:numFmt w:val="bullet"/>
+      <w:lvlText w:val=""/>
+      <w:lvlJc w:val="left"/>
+      <w:pPr>
+        <w:tabs>
+          <w:tab w:val="num" w:pos="720"/>
+        </w:tabs>
+        <w:ind w:left="720" w:hanging="360"/>
+      </w:pPr>
+      <w:rPr>
+        <w:rFonts w:ascii="Symbol" w:hAnsi="Symbol" w:cs="Symbol" w:hint="default"/>
+      </w:rPr>
+    </w:lvl>
+    <w:lvl w:ilvl="1">
+      <w:start w:val="1"/>
+      <w:numFmt w:val="bullet"/>
+      <w:lvlText w:val="◦"/>
+      <w:lvlJc w:val="left"/>
+      <w:pPr>
+        <w:tabs>
+          <w:tab w:val="num" w:pos="1080"/>
+        </w:tabs>
+        <w:ind w:left="1080" w:hanging="360"/>
+      </w:pPr>
+      <w:rPr>
+        <w:rFonts w:ascii="OpenSymbol" w:hAnsi="OpenSymbol" w:cs="OpenSymbol" w:hint="default"/>
+      </w:rPr>
+    </w:lvl>
+    <w:lvl w:ilvl="2">
+      <w:start w:val="1"/>
+      <w:numFmt w:val="bullet"/>
+      <w:lvlText w:val="▪"/>
+      <w:lvlJc w:val="left"/>
+      <w:pPr>
+        <w:tabs>
+          <w:tab w:val="num" w:pos="1440"/>
+        </w:tabs>
+        <w:ind w:left="1440" w:hanging="360"/>
+      </w:pPr>
+      <w:rPr>
+        <w:rFonts w:ascii="OpenSymbol" w:hAnsi="OpenSymbol" w:cs="OpenSymbol" w:hint="default"/>
+      </w:rPr>
+    </w:lvl>
+    <w:lvl w:ilvl="3">
+      <w:start w:val="1"/>
+      <w:numFmt w:val="bullet"/>
+      <w:lvlText w:val=""/>
+      <w:lvlJc w:val="left"/>
+      <w:pPr>
+        <w:tabs>
+          <w:tab w:val="num" w:pos="1800"/>
+        </w:tabs>
+        <w:ind w:left="1800" w:hanging="360"/>
+      </w:pPr>
+      <w:rPr>
+        <w:rFonts w:ascii="Symbol" w:hAnsi="Symbol" w:cs="Symbol" w:hint="default"/>
+      </w:rPr>
+    </w:lvl>
+    <w:lvl w:ilvl="4">
+      <w:start w:val="1"/>
+      <w:numFmt w:val="bullet"/>
+      <w:lvlText w:val="◦"/>
+      <w:lvlJc w:val="left"/>
+      <w:pPr>
+        <w:tabs>
+          <w:tab w:val="num" w:pos="2160"/>
+        </w:tabs>
+        <w:ind w:left="2160" w:hanging="360"/>
+      </w:pPr>
+      <w:rPr>
+        <w:rFonts w:ascii="OpenSymbol" w:hAnsi="OpenSymbol" w:cs="OpenSymbol" w:hint="default"/>
+      </w:rPr>
+    </w:lvl>
+    <w:lvl w:ilvl="5">
+      <w:start w:val="1"/>
+      <w:numFmt w:val="bullet"/>
+      <w:lvlText w:val="▪"/>
+      <w:lvlJc w:val="left"/>
+      <w:pPr>
+        <w:tabs>
+          <w:tab w:val="num" w:pos="2520"/>
+        </w:tabs>
+        <w:ind w:left="2520" w:hanging="360"/>
+      </w:pPr>
+      <w:rPr>
+        <w:rFonts w:ascii="OpenSymbol" w:hAnsi="OpenSymbol" w:cs="OpenSymbol" w:hint="default"/>
+      </w:rPr>
+    </w:lvl>
+    <w:lvl w:ilvl="6">
+      <w:start w:val="1"/>
+      <w:numFmt w:val="bullet"/>
+      <w:lvlText w:val=""/>
+      <w:lvlJc w:val="left"/>
+      <w:pPr>
+        <w:tabs>
+          <w:tab w:val="num" w:pos="2880"/>
+        </w:tabs>
+        <w:ind w:left="2880" w:hanging="360"/>
+      </w:pPr>
+      <w:rPr>
+        <w:rFonts w:ascii="Symbol" w:hAnsi="Symbol" w:cs="Symbol" w:hint="default"/>
+      </w:rPr>
+    </w:lvl>
+    <w:lvl w:ilvl="7">
+      <w:start w:val="1"/>
+      <w:numFmt w:val="bullet"/>
+      <w:lvlText w:val="◦"/>
+      <w:lvlJc w:val="left"/>
+      <w:pPr>
+        <w:tabs>
+          <w:tab w:val="num" w:pos="3240"/>
+        </w:tabs>
+        <w:ind w:left="3240" w:hanging="360"/>
+      </w:pPr>
+      <w:rPr>
+        <w:rFonts w:ascii="OpenSymbol" w:hAnsi="OpenSymbol" w:cs="OpenSymbol" w:hint="default"/>
+      </w:rPr>
+    </w:lvl>
+    <w:lvl w:ilvl="8">
+      <w:start w:val="1"/>
+      <w:numFmt w:val="bullet"/>
+      <w:lvlText w:val="▪"/>
+      <w:lvlJc w:val="left"/>
+      <w:pPr>
+        <w:tabs>
+          <w:tab w:val="num" w:pos="3600"/>
+        </w:tabs>
+        <w:ind w:left="3600" w:hanging="360"/>
+      </w:pPr>
+      <w:rPr>
+        <w:rFonts w:ascii="OpenSymbol" w:hAnsi="OpenSymbol" w:cs="OpenSymbol" w:hint="default"/>
+      </w:rPr>
+    </w:lvl>
+  </w:abstractNum>
+  <w:abstractNum w:abstractNumId="8">
+    <w:lvl w:ilvl="0">
+      <w:start w:val="1"/>
       <w:numFmt w:val="none"/>
       <w:suff w:val="nothing"/>
       <w:lvlText w:val=""/>
       <w:lvlJc w:val="left"/>
       <w:pPr>
+        <w:tabs>
+          <w:tab w:val="num" w:pos="0"/>
+        </w:tabs>
         <w:ind w:left="0" w:hanging="0"/>
       </w:pPr>
     </w:lvl>
@@ -219,6 +1226,9 @@
       <w:lvlText w:val=""/>
       <w:lvlJc w:val="left"/>
       <w:pPr>
+        <w:tabs>
+          <w:tab w:val="num" w:pos="0"/>
+        </w:tabs>
         <w:ind w:left="0" w:hanging="0"/>
       </w:pPr>
     </w:lvl>
@@ -229,6 +1239,9 @@
       <w:lvlText w:val=""/>
       <w:lvlJc w:val="left"/>
       <w:pPr>
+        <w:tabs>
+          <w:tab w:val="num" w:pos="0"/>
+        </w:tabs>
         <w:ind w:left="0" w:hanging="0"/>
       </w:pPr>
     </w:lvl>
@@ -239,6 +1252,9 @@
       <w:lvlText w:val=""/>
       <w:lvlJc w:val="left"/>
       <w:pPr>
+        <w:tabs>
+          <w:tab w:val="num" w:pos="0"/>
+        </w:tabs>
         <w:ind w:left="0" w:hanging="0"/>
       </w:pPr>
     </w:lvl>
@@ -249,6 +1265,9 @@
       <w:lvlText w:val=""/>
       <w:lvlJc w:val="left"/>
       <w:pPr>
+        <w:tabs>
+          <w:tab w:val="num" w:pos="0"/>
+        </w:tabs>
         <w:ind w:left="0" w:hanging="0"/>
       </w:pPr>
     </w:lvl>
@@ -259,6 +1278,9 @@
       <w:lvlText w:val=""/>
       <w:lvlJc w:val="left"/>
       <w:pPr>
+        <w:tabs>
+          <w:tab w:val="num" w:pos="0"/>
+        </w:tabs>
         <w:ind w:left="0" w:hanging="0"/>
       </w:pPr>
     </w:lvl>
@@ -269,6 +1291,9 @@
       <w:lvlText w:val=""/>
       <w:lvlJc w:val="left"/>
       <w:pPr>
+        <w:tabs>
+          <w:tab w:val="num" w:pos="0"/>
+        </w:tabs>
         <w:ind w:left="0" w:hanging="0"/>
       </w:pPr>
     </w:lvl>
@@ -279,6 +1304,9 @@
       <w:lvlText w:val=""/>
       <w:lvlJc w:val="left"/>
       <w:pPr>
+        <w:tabs>
+          <w:tab w:val="num" w:pos="0"/>
+        </w:tabs>
         <w:ind w:left="0" w:hanging="0"/>
       </w:pPr>
     </w:lvl>
@@ -289,6 +1317,9 @@
       <w:lvlText w:val=""/>
       <w:lvlJc w:val="left"/>
       <w:pPr>
+        <w:tabs>
+          <w:tab w:val="num" w:pos="0"/>
+        </w:tabs>
         <w:ind w:left="0" w:hanging="0"/>
       </w:pPr>
     </w:lvl>
@@ -298,6 +1329,24 @@
   </w:num>
   <w:num w:numId="2">
     <w:abstractNumId w:val="2"/>
+  </w:num>
+  <w:num w:numId="3">
+    <w:abstractNumId w:val="3"/>
+  </w:num>
+  <w:num w:numId="4">
+    <w:abstractNumId w:val="4"/>
+  </w:num>
+  <w:num w:numId="5">
+    <w:abstractNumId w:val="5"/>
+  </w:num>
+  <w:num w:numId="6">
+    <w:abstractNumId w:val="6"/>
+  </w:num>
+  <w:num w:numId="7">
+    <w:abstractNumId w:val="7"/>
+  </w:num>
+  <w:num w:numId="8">
+    <w:abstractNumId w:val="8"/>
   </w:num>
 </w:numbering>
 </file>
@@ -314,7 +1363,9 @@
       </w:rPr>
     </w:rPrDefault>
     <w:pPrDefault>
-      <w:pPr/>
+      <w:pPr>
+        <w:suppressAutoHyphens w:val="true"/>
+      </w:pPr>
     </w:pPrDefault>
   </w:docDefaults>
   <w:latentStyles w:defLockedState="0" w:defUIPriority="0" w:defSemiHidden="0" w:defUnhideWhenUsed="0" w:defQFormat="0" w:count="276"/>
@@ -339,7 +1390,7 @@
   <w:style w:type="paragraph" w:styleId="Heading1">
     <w:name w:val="Heading 1"/>
     <w:basedOn w:val="Normal"/>
-    <w:next w:val="TextBody"/>
+    <w:next w:val="BodyText"/>
     <w:link w:val="Heading1Char"/>
     <w:uiPriority w:val="9"/>
     <w:qFormat/>
@@ -352,7 +1403,7 @@
     </w:pPr>
     <w:rPr>
       <w:rFonts w:ascii="Aptos Display" w:hAnsi="Aptos Display" w:eastAsia="" w:cs="" w:asciiTheme="majorHAnsi" w:cstheme="majorBidi" w:eastAsiaTheme="majorEastAsia" w:hAnsiTheme="majorHAnsi"/>
-      <w:color w:val="0F4761" w:themeColor="accent1" w:themeShade="bf"/>
+      <w:color w:themeColor="accent1" w:themeShade="bf" w:val="0F4761"/>
       <w:sz w:val="40"/>
       <w:szCs w:val="40"/>
     </w:rPr>
@@ -360,7 +1411,7 @@
   <w:style w:type="paragraph" w:styleId="Heading2">
     <w:name w:val="Heading 2"/>
     <w:basedOn w:val="Normal"/>
-    <w:next w:val="TextBody"/>
+    <w:next w:val="BodyText"/>
     <w:link w:val="Heading2Char"/>
     <w:uiPriority w:val="9"/>
     <w:semiHidden/>
@@ -375,7 +1426,7 @@
     </w:pPr>
     <w:rPr>
       <w:rFonts w:ascii="Aptos Display" w:hAnsi="Aptos Display" w:eastAsia="" w:cs="" w:asciiTheme="majorHAnsi" w:cstheme="majorBidi" w:eastAsiaTheme="majorEastAsia" w:hAnsiTheme="majorHAnsi"/>
-      <w:color w:val="0F4761" w:themeColor="accent1" w:themeShade="bf"/>
+      <w:color w:themeColor="accent1" w:themeShade="bf" w:val="0F4761"/>
       <w:sz w:val="32"/>
       <w:szCs w:val="32"/>
     </w:rPr>
@@ -383,7 +1434,7 @@
   <w:style w:type="paragraph" w:styleId="Heading3">
     <w:name w:val="Heading 3"/>
     <w:basedOn w:val="Normal"/>
-    <w:next w:val="TextBody"/>
+    <w:next w:val="BodyText"/>
     <w:link w:val="Heading3Char"/>
     <w:uiPriority w:val="9"/>
     <w:semiHidden/>
@@ -398,7 +1449,7 @@
     </w:pPr>
     <w:rPr>
       <w:rFonts w:eastAsia="" w:cs="" w:cstheme="majorBidi" w:eastAsiaTheme="majorEastAsia"/>
-      <w:color w:val="0F4761" w:themeColor="accent1" w:themeShade="bf"/>
+      <w:color w:themeColor="accent1" w:themeShade="bf" w:val="0F4761"/>
       <w:sz w:val="28"/>
       <w:szCs w:val="28"/>
     </w:rPr>
@@ -406,7 +1457,7 @@
   <w:style w:type="paragraph" w:styleId="Heading4">
     <w:name w:val="Heading 4"/>
     <w:basedOn w:val="Normal"/>
-    <w:next w:val="TextBody"/>
+    <w:next w:val="BodyText"/>
     <w:link w:val="Heading4Char"/>
     <w:uiPriority w:val="9"/>
     <w:semiHidden/>
@@ -423,13 +1474,13 @@
       <w:rFonts w:eastAsia="" w:cs="" w:cstheme="majorBidi" w:eastAsiaTheme="majorEastAsia"/>
       <w:i/>
       <w:iCs/>
-      <w:color w:val="0F4761" w:themeColor="accent1" w:themeShade="bf"/>
+      <w:color w:themeColor="accent1" w:themeShade="bf" w:val="0F4761"/>
     </w:rPr>
   </w:style>
   <w:style w:type="paragraph" w:styleId="Heading5">
     <w:name w:val="Heading 5"/>
     <w:basedOn w:val="Normal"/>
-    <w:next w:val="TextBody"/>
+    <w:next w:val="BodyText"/>
     <w:link w:val="Heading5Char"/>
     <w:uiPriority w:val="9"/>
     <w:semiHidden/>
@@ -444,13 +1495,13 @@
     </w:pPr>
     <w:rPr>
       <w:rFonts w:eastAsia="" w:cs="" w:cstheme="majorBidi" w:eastAsiaTheme="majorEastAsia"/>
-      <w:color w:val="0F4761" w:themeColor="accent1" w:themeShade="bf"/>
+      <w:color w:themeColor="accent1" w:themeShade="bf" w:val="0F4761"/>
     </w:rPr>
   </w:style>
   <w:style w:type="paragraph" w:styleId="Heading6">
     <w:name w:val="Heading 6"/>
     <w:basedOn w:val="Normal"/>
-    <w:next w:val="TextBody"/>
+    <w:next w:val="BodyText"/>
     <w:link w:val="Heading6Char"/>
     <w:uiPriority w:val="9"/>
     <w:semiHidden/>
@@ -467,13 +1518,13 @@
       <w:rFonts w:eastAsia="" w:cs="" w:cstheme="majorBidi" w:eastAsiaTheme="majorEastAsia"/>
       <w:i/>
       <w:iCs/>
-      <w:color w:val="595959" w:themeColor="text1" w:themeTint="a6"/>
+      <w:color w:themeColor="text1" w:themeTint="a6" w:val="595959"/>
     </w:rPr>
   </w:style>
   <w:style w:type="paragraph" w:styleId="Heading7">
     <w:name w:val="Heading 7"/>
     <w:basedOn w:val="Normal"/>
-    <w:next w:val="TextBody"/>
+    <w:next w:val="BodyText"/>
     <w:link w:val="Heading7Char"/>
     <w:uiPriority w:val="9"/>
     <w:semiHidden/>
@@ -488,13 +1539,13 @@
     </w:pPr>
     <w:rPr>
       <w:rFonts w:eastAsia="" w:cs="" w:cstheme="majorBidi" w:eastAsiaTheme="majorEastAsia"/>
-      <w:color w:val="595959" w:themeColor="text1" w:themeTint="a6"/>
+      <w:color w:themeColor="text1" w:themeTint="a6" w:val="595959"/>
     </w:rPr>
   </w:style>
   <w:style w:type="paragraph" w:styleId="Heading8">
     <w:name w:val="Heading 8"/>
     <w:basedOn w:val="Normal"/>
-    <w:next w:val="TextBody"/>
+    <w:next w:val="BodyText"/>
     <w:link w:val="Heading8Char"/>
     <w:uiPriority w:val="9"/>
     <w:semiHidden/>
@@ -511,13 +1562,13 @@
       <w:rFonts w:eastAsia="" w:cs="" w:cstheme="majorBidi" w:eastAsiaTheme="majorEastAsia"/>
       <w:i/>
       <w:iCs/>
-      <w:color w:val="272727" w:themeColor="text1" w:themeTint="d8"/>
+      <w:color w:themeColor="text1" w:themeTint="d8" w:val="272727"/>
     </w:rPr>
   </w:style>
   <w:style w:type="paragraph" w:styleId="Heading9">
     <w:name w:val="Heading 9"/>
     <w:basedOn w:val="Normal"/>
-    <w:next w:val="TextBody"/>
+    <w:next w:val="BodyText"/>
     <w:link w:val="Heading9Char"/>
     <w:uiPriority w:val="9"/>
     <w:semiHidden/>
@@ -532,13 +1583,12 @@
     </w:pPr>
     <w:rPr>
       <w:rFonts w:eastAsia="" w:cs="" w:cstheme="majorBidi" w:eastAsiaTheme="majorEastAsia"/>
-      <w:color w:val="272727" w:themeColor="text1" w:themeTint="d8"/>
+      <w:color w:themeColor="text1" w:themeTint="d8" w:val="272727"/>
     </w:rPr>
   </w:style>
   <w:style w:type="character" w:styleId="TitleChar" w:customStyle="1">
     <w:name w:val="Title Char"/>
     <w:basedOn w:val="DefaultParagraphFont"/>
-    <w:link w:val="Title"/>
     <w:uiPriority w:val="10"/>
     <w:qFormat/>
     <w:rsid w:val="00a10fd9"/>
@@ -553,13 +1603,12 @@
   <w:style w:type="character" w:styleId="SubtitleChar" w:customStyle="1">
     <w:name w:val="Subtitle Char"/>
     <w:basedOn w:val="DefaultParagraphFont"/>
-    <w:link w:val="Subtitle"/>
     <w:uiPriority w:val="11"/>
     <w:qFormat/>
     <w:rsid w:val="00a10fd9"/>
     <w:rPr>
       <w:rFonts w:eastAsia="" w:cs="" w:cstheme="majorBidi" w:eastAsiaTheme="majorEastAsia"/>
-      <w:color w:val="595959" w:themeColor="text1" w:themeTint="a6"/>
+      <w:color w:themeColor="text1" w:themeTint="a6" w:val="595959"/>
       <w:spacing w:val="15"/>
       <w:sz w:val="28"/>
       <w:szCs w:val="28"/>
@@ -568,13 +1617,12 @@
   <w:style w:type="character" w:styleId="Heading1Char" w:customStyle="1">
     <w:name w:val="Heading 1 Char"/>
     <w:basedOn w:val="DefaultParagraphFont"/>
-    <w:link w:val="Heading1"/>
     <w:uiPriority w:val="9"/>
     <w:qFormat/>
     <w:rsid w:val="00a10fd9"/>
     <w:rPr>
       <w:rFonts w:ascii="Aptos Display" w:hAnsi="Aptos Display" w:eastAsia="" w:cs="" w:asciiTheme="majorHAnsi" w:cstheme="majorBidi" w:eastAsiaTheme="majorEastAsia" w:hAnsiTheme="majorHAnsi"/>
-      <w:color w:val="0F4761" w:themeColor="accent1" w:themeShade="bf"/>
+      <w:color w:themeColor="accent1" w:themeShade="bf" w:val="0F4761"/>
       <w:sz w:val="40"/>
       <w:szCs w:val="40"/>
     </w:rPr>
@@ -582,14 +1630,13 @@
   <w:style w:type="character" w:styleId="Heading2Char" w:customStyle="1">
     <w:name w:val="Heading 2 Char"/>
     <w:basedOn w:val="DefaultParagraphFont"/>
-    <w:link w:val="Heading2"/>
     <w:uiPriority w:val="9"/>
     <w:semiHidden/>
     <w:qFormat/>
     <w:rsid w:val="00a10fd9"/>
     <w:rPr>
       <w:rFonts w:ascii="Aptos Display" w:hAnsi="Aptos Display" w:eastAsia="" w:cs="" w:asciiTheme="majorHAnsi" w:cstheme="majorBidi" w:eastAsiaTheme="majorEastAsia" w:hAnsiTheme="majorHAnsi"/>
-      <w:color w:val="0F4761" w:themeColor="accent1" w:themeShade="bf"/>
+      <w:color w:themeColor="accent1" w:themeShade="bf" w:val="0F4761"/>
       <w:sz w:val="32"/>
       <w:szCs w:val="32"/>
     </w:rPr>
@@ -597,14 +1644,13 @@
   <w:style w:type="character" w:styleId="Heading3Char" w:customStyle="1">
     <w:name w:val="Heading 3 Char"/>
     <w:basedOn w:val="DefaultParagraphFont"/>
-    <w:link w:val="Heading3"/>
     <w:uiPriority w:val="9"/>
     <w:semiHidden/>
     <w:qFormat/>
     <w:rsid w:val="00a10fd9"/>
     <w:rPr>
       <w:rFonts w:eastAsia="" w:cs="" w:cstheme="majorBidi" w:eastAsiaTheme="majorEastAsia"/>
-      <w:color w:val="0F4761" w:themeColor="accent1" w:themeShade="bf"/>
+      <w:color w:themeColor="accent1" w:themeShade="bf" w:val="0F4761"/>
       <w:sz w:val="28"/>
       <w:szCs w:val="28"/>
     </w:rPr>
@@ -612,7 +1658,6 @@
   <w:style w:type="character" w:styleId="Heading4Char" w:customStyle="1">
     <w:name w:val="Heading 4 Char"/>
     <w:basedOn w:val="DefaultParagraphFont"/>
-    <w:link w:val="Heading4"/>
     <w:uiPriority w:val="9"/>
     <w:semiHidden/>
     <w:qFormat/>
@@ -621,26 +1666,24 @@
       <w:rFonts w:eastAsia="" w:cs="" w:cstheme="majorBidi" w:eastAsiaTheme="majorEastAsia"/>
       <w:i/>
       <w:iCs/>
-      <w:color w:val="0F4761" w:themeColor="accent1" w:themeShade="bf"/>
+      <w:color w:themeColor="accent1" w:themeShade="bf" w:val="0F4761"/>
     </w:rPr>
   </w:style>
   <w:style w:type="character" w:styleId="Heading5Char" w:customStyle="1">
     <w:name w:val="Heading 5 Char"/>
     <w:basedOn w:val="DefaultParagraphFont"/>
-    <w:link w:val="Heading5"/>
     <w:uiPriority w:val="9"/>
     <w:semiHidden/>
     <w:qFormat/>
     <w:rsid w:val="00a10fd9"/>
     <w:rPr>
       <w:rFonts w:eastAsia="" w:cs="" w:cstheme="majorBidi" w:eastAsiaTheme="majorEastAsia"/>
-      <w:color w:val="0F4761" w:themeColor="accent1" w:themeShade="bf"/>
+      <w:color w:themeColor="accent1" w:themeShade="bf" w:val="0F4761"/>
     </w:rPr>
   </w:style>
   <w:style w:type="character" w:styleId="Heading6Char" w:customStyle="1">
     <w:name w:val="Heading 6 Char"/>
     <w:basedOn w:val="DefaultParagraphFont"/>
-    <w:link w:val="Heading6"/>
     <w:uiPriority w:val="9"/>
     <w:semiHidden/>
     <w:qFormat/>
@@ -649,26 +1692,24 @@
       <w:rFonts w:eastAsia="" w:cs="" w:cstheme="majorBidi" w:eastAsiaTheme="majorEastAsia"/>
       <w:i/>
       <w:iCs/>
-      <w:color w:val="595959" w:themeColor="text1" w:themeTint="a6"/>
+      <w:color w:themeColor="text1" w:themeTint="a6" w:val="595959"/>
     </w:rPr>
   </w:style>
   <w:style w:type="character" w:styleId="Heading7Char" w:customStyle="1">
     <w:name w:val="Heading 7 Char"/>
     <w:basedOn w:val="DefaultParagraphFont"/>
-    <w:link w:val="Heading7"/>
     <w:uiPriority w:val="9"/>
     <w:semiHidden/>
     <w:qFormat/>
     <w:rsid w:val="00a10fd9"/>
     <w:rPr>
       <w:rFonts w:eastAsia="" w:cs="" w:cstheme="majorBidi" w:eastAsiaTheme="majorEastAsia"/>
-      <w:color w:val="595959" w:themeColor="text1" w:themeTint="a6"/>
+      <w:color w:themeColor="text1" w:themeTint="a6" w:val="595959"/>
     </w:rPr>
   </w:style>
   <w:style w:type="character" w:styleId="Heading8Char" w:customStyle="1">
     <w:name w:val="Heading 8 Char"/>
     <w:basedOn w:val="DefaultParagraphFont"/>
-    <w:link w:val="Heading8"/>
     <w:uiPriority w:val="9"/>
     <w:semiHidden/>
     <w:qFormat/>
@@ -677,20 +1718,19 @@
       <w:rFonts w:eastAsia="" w:cs="" w:cstheme="majorBidi" w:eastAsiaTheme="majorEastAsia"/>
       <w:i/>
       <w:iCs/>
-      <w:color w:val="272727" w:themeColor="text1" w:themeTint="d8"/>
+      <w:color w:themeColor="text1" w:themeTint="d8" w:val="272727"/>
     </w:rPr>
   </w:style>
   <w:style w:type="character" w:styleId="Heading9Char" w:customStyle="1">
     <w:name w:val="Heading 9 Char"/>
     <w:basedOn w:val="DefaultParagraphFont"/>
-    <w:link w:val="Heading9"/>
     <w:uiPriority w:val="9"/>
     <w:semiHidden/>
     <w:qFormat/>
     <w:rsid w:val="00a10fd9"/>
     <w:rPr>
       <w:rFonts w:eastAsia="" w:cs="" w:cstheme="majorBidi" w:eastAsiaTheme="majorEastAsia"/>
-      <w:color w:val="272727" w:themeColor="text1" w:themeTint="d8"/>
+      <w:color w:themeColor="text1" w:themeTint="d8" w:val="272727"/>
     </w:rPr>
   </w:style>
   <w:style w:type="character" w:styleId="DefaultParagraphFont" w:default="1">
@@ -703,7 +1743,6 @@
   <w:style w:type="character" w:styleId="BodyTextChar" w:customStyle="1">
     <w:name w:val="Body Text Char"/>
     <w:basedOn w:val="DefaultParagraphFont"/>
-    <w:link w:val="BodyText"/>
     <w:qFormat/>
     <w:rPr/>
   </w:style>
@@ -732,6 +1771,7 @@
   </w:style>
   <w:style w:type="character" w:styleId="FootnoteAnchor">
     <w:name w:val="Footnote Anchor"/>
+    <w:qFormat/>
     <w:rPr>
       <w:vertAlign w:val="superscript"/>
     </w:rPr>
@@ -739,8 +1779,9 @@
   <w:style w:type="character" w:styleId="InternetLink">
     <w:name w:val="Internet Link"/>
     <w:basedOn w:val="BodyTextChar"/>
-    <w:rPr>
-      <w:color w:val="4F81BD" w:themeColor="accent1"/>
+    <w:qFormat/>
+    <w:rPr>
+      <w:color w:themeColor="accent1" w:val="4F81BD"/>
     </w:rPr>
   </w:style>
   <w:style w:type="character" w:styleId="KeywordTok" w:customStyle="1">
@@ -1000,10 +2041,24 @@
     <w:qFormat/>
     <w:rPr/>
   </w:style>
-  <w:style w:type="paragraph" w:styleId="Heading">
-    <w:name w:val="Heading"/>
+  <w:style w:type="character" w:styleId="Bolos">
+    <w:name w:val="Bolos"/>
+    <w:qFormat/>
+    <w:rPr>
+      <w:rFonts w:ascii="OpenSymbol" w:hAnsi="OpenSymbol" w:eastAsia="OpenSymbol" w:cs="OpenSymbol"/>
+    </w:rPr>
+  </w:style>
+  <w:style w:type="character" w:styleId="Textooriginal">
+    <w:name w:val="Texto original"/>
+    <w:qFormat/>
+    <w:rPr>
+      <w:rFonts w:ascii="Liberation Mono" w:hAnsi="Liberation Mono" w:eastAsia="Liberation Mono" w:cs="Liberation Mono"/>
+    </w:rPr>
+  </w:style>
+  <w:style w:type="paragraph" w:styleId="Ttulo">
+    <w:name w:val="Título"/>
     <w:basedOn w:val="Normal"/>
-    <w:next w:val="TextBody"/>
+    <w:next w:val="BodyText"/>
     <w:qFormat/>
     <w:pPr>
       <w:keepNext w:val="true"/>
@@ -1015,7 +2070,7 @@
       <w:szCs w:val="28"/>
     </w:rPr>
   </w:style>
-  <w:style w:type="paragraph" w:styleId="TextBody">
+  <w:style w:type="paragraph" w:styleId="BodyText">
     <w:name w:val="Body Text"/>
     <w:basedOn w:val="Normal"/>
     <w:link w:val="BodyTextChar"/>
@@ -1027,7 +2082,7 @@
   </w:style>
   <w:style w:type="paragraph" w:styleId="List">
     <w:name w:val="List"/>
-    <w:basedOn w:val="TextBody"/>
+    <w:basedOn w:val="BodyText"/>
     <w:pPr/>
     <w:rPr>
       <w:rFonts w:cs="Lohit Devanagari"/>
@@ -1045,8 +2100,8 @@
       <w:i/>
     </w:rPr>
   </w:style>
-  <w:style w:type="paragraph" w:styleId="Index">
-    <w:name w:val="Index"/>
+  <w:style w:type="paragraph" w:styleId="ndice">
+    <w:name w:val="Índice"/>
     <w:basedOn w:val="Normal"/>
     <w:qFormat/>
     <w:pPr>
@@ -1058,15 +2113,15 @@
   </w:style>
   <w:style w:type="paragraph" w:styleId="FirstParagraph" w:customStyle="1">
     <w:name w:val="First Paragraph"/>
-    <w:basedOn w:val="TextBody"/>
-    <w:next w:val="TextBody"/>
+    <w:basedOn w:val="BodyText"/>
+    <w:next w:val="BodyText"/>
     <w:qFormat/>
     <w:pPr/>
     <w:rPr/>
   </w:style>
   <w:style w:type="paragraph" w:styleId="Compact" w:customStyle="1">
     <w:name w:val="Compact"/>
-    <w:basedOn w:val="TextBody"/>
+    <w:basedOn w:val="BodyText"/>
     <w:qFormat/>
     <w:pPr>
       <w:spacing w:before="36" w:after="36"/>
@@ -1076,7 +2131,7 @@
   <w:style w:type="paragraph" w:styleId="Title">
     <w:name w:val="Title"/>
     <w:basedOn w:val="Normal"/>
-    <w:next w:val="TextBody"/>
+    <w:next w:val="BodyText"/>
     <w:link w:val="TitleChar"/>
     <w:uiPriority w:val="10"/>
     <w:qFormat/>
@@ -1097,7 +2152,7 @@
   <w:style w:type="paragraph" w:styleId="Subtitle">
     <w:name w:val="Subtitle"/>
     <w:basedOn w:val="Title"/>
-    <w:next w:val="TextBody"/>
+    <w:next w:val="BodyText"/>
     <w:link w:val="SubtitleChar"/>
     <w:uiPriority w:val="11"/>
     <w:qFormat/>
@@ -1112,13 +2167,14 @@
   </w:style>
   <w:style w:type="paragraph" w:styleId="Author" w:customStyle="1">
     <w:name w:val="Author"/>
-    <w:next w:val="TextBody"/>
+    <w:next w:val="BodyText"/>
     <w:qFormat/>
     <w:pPr>
       <w:keepNext w:val="true"/>
       <w:keepLines/>
       <w:widowControl/>
       <w:bidi w:val="0"/>
+      <w:spacing w:before="0" w:after="0"/>
       <w:jc w:val="center"/>
     </w:pPr>
     <w:rPr>
@@ -1132,13 +2188,14 @@
   </w:style>
   <w:style w:type="paragraph" w:styleId="Date">
     <w:name w:val="Date"/>
-    <w:next w:val="TextBody"/>
+    <w:next w:val="BodyText"/>
     <w:qFormat/>
     <w:pPr>
       <w:keepNext w:val="true"/>
       <w:keepLines/>
       <w:widowControl/>
       <w:bidi w:val="0"/>
+      <w:spacing w:before="0" w:after="0"/>
       <w:jc w:val="center"/>
     </w:pPr>
     <w:rPr>
@@ -1169,7 +2226,7 @@
   <w:style w:type="paragraph" w:styleId="Abstract" w:customStyle="1">
     <w:name w:val="Abstract"/>
     <w:basedOn w:val="Normal"/>
-    <w:next w:val="TextBody"/>
+    <w:next w:val="BodyText"/>
     <w:qFormat/>
     <w:pPr>
       <w:keepNext w:val="true"/>
@@ -1190,18 +2247,18 @@
   </w:style>
   <w:style w:type="paragraph" w:styleId="BlockText">
     <w:name w:val="Block Text"/>
-    <w:basedOn w:val="TextBody"/>
-    <w:next w:val="TextBody"/>
+    <w:basedOn w:val="BodyText"/>
+    <w:next w:val="BodyText"/>
     <w:uiPriority w:val="9"/>
     <w:unhideWhenUsed/>
     <w:qFormat/>
     <w:pPr>
       <w:spacing w:before="100" w:after="100"/>
-      <w:ind w:left="480" w:right="480" w:hanging="0"/>
+      <w:ind w:hanging="0" w:left="480" w:right="480"/>
     </w:pPr>
     <w:rPr/>
   </w:style>
-  <w:style w:type="paragraph" w:styleId="Footnote">
+  <w:style w:type="paragraph" w:styleId="FootnoteText">
     <w:name w:val="Footnote Text"/>
     <w:basedOn w:val="Normal"/>
     <w:uiPriority w:val="9"/>
@@ -1212,13 +2269,13 @@
   </w:style>
   <w:style w:type="paragraph" w:styleId="FootnoteBlockText">
     <w:name w:val="Footnote Block Text"/>
-    <w:basedOn w:val="Footnote"/>
+    <w:basedOn w:val="FootnoteText"/>
     <w:uiPriority w:val="9"/>
     <w:unhideWhenUsed/>
     <w:qFormat/>
     <w:pPr>
       <w:spacing w:before="100" w:after="100"/>
-      <w:ind w:left="480" w:right="480" w:hanging="0"/>
+      <w:ind w:hanging="0" w:left="480" w:right="480"/>
     </w:pPr>
     <w:rPr/>
   </w:style>
@@ -1258,8 +2315,8 @@
     <w:pPr/>
     <w:rPr/>
   </w:style>
-  <w:style w:type="paragraph" w:styleId="Figure" w:customStyle="1">
-    <w:name w:val="Figure"/>
+  <w:style w:type="paragraph" w:styleId="Figura" w:customStyle="1">
+    <w:name w:val="Figura"/>
     <w:basedOn w:val="Normal"/>
     <w:qFormat/>
     <w:pPr/>
@@ -1267,17 +2324,23 @@
   </w:style>
   <w:style w:type="paragraph" w:styleId="CaptionedFigure" w:customStyle="1">
     <w:name w:val="Captioned Figure"/>
-    <w:basedOn w:val="Figure"/>
+    <w:basedOn w:val="Figura"/>
     <w:qFormat/>
     <w:pPr>
       <w:keepNext w:val="true"/>
     </w:pPr>
     <w:rPr/>
   </w:style>
+  <w:style w:type="paragraph" w:styleId="IndexHeading">
+    <w:name w:val="Index Heading"/>
+    <w:basedOn w:val="Ttulo"/>
+    <w:pPr/>
+    <w:rPr/>
+  </w:style>
   <w:style w:type="paragraph" w:styleId="TOCHeading">
     <w:name w:val="TOC Heading"/>
     <w:basedOn w:val="Heading1"/>
-    <w:next w:val="TextBody"/>
+    <w:next w:val="BodyText"/>
     <w:uiPriority w:val="39"/>
     <w:unhideWhenUsed/>
     <w:qFormat/>
@@ -1288,7 +2351,7 @@
       <w:rFonts w:ascii="Aptos Display" w:hAnsi="Aptos Display" w:eastAsia="" w:cs="" w:asciiTheme="majorHAnsi" w:cstheme="majorBidi" w:eastAsiaTheme="majorEastAsia" w:hAnsiTheme="majorHAnsi"/>
       <w:b w:val="false"/>
       <w:bCs w:val="false"/>
-      <w:color w:val="365F91" w:themeColor="accent1" w:themeShade="bf"/>
+      <w:color w:themeColor="accent1" w:themeShade="bf" w:val="365F91"/>
     </w:rPr>
   </w:style>
   <w:style w:type="paragraph" w:styleId="SourceCode" w:customStyle="1">
@@ -1306,7 +2369,6 @@
     <w:unhideWhenUsed/>
     <w:qFormat/>
     <w:tblPr>
-      <w:tblInd w:w="0" w:type="dxa"/>
       <w:tblCellMar>
         <w:top w:w="0" w:type="dxa"/>
         <w:left w:w="108" w:type="dxa"/>
@@ -1315,9 +2377,7 @@
       </w:tblCellMar>
     </w:tblPr>
     <w:tblStylePr w:type="firstRow">
-      <w:tblPr>
-        <w:tblInd w:w="0" w:type="dxa"/>
-      </w:tblPr>
+      <w:tblPr/>
       <w:tcPr>
         <w:tcBorders>
           <w:bottom w:val="single"/>
@@ -1330,195 +2390,97 @@
 </file>
 
 <file path=word/theme/theme1.xml><?xml version="1.0" encoding="utf-8"?>
-<a:theme xmlns:a="http://schemas.openxmlformats.org/drawingml/2006/main" name="Office Theme">
+<a:theme xmlns:a="http://schemas.openxmlformats.org/drawingml/2006/main" xmlns:r="http://schemas.openxmlformats.org/officeDocument/2006/relationships" name="Office Theme">
   <a:themeElements>
     <a:clrScheme name="Office">
       <a:dk1>
-        <a:sysClr val="windowText" lastClr="000000"/>
+        <a:srgbClr val="000000"/>
       </a:dk1>
       <a:lt1>
-        <a:sysClr val="window" lastClr="FFFFFF"/>
+        <a:srgbClr val="ffffff"/>
       </a:lt1>
       <a:dk2>
-        <a:srgbClr val="0E2841"/>
+        <a:srgbClr val="0e2841"/>
       </a:dk2>
       <a:lt2>
-        <a:srgbClr val="E8E8E8"/>
+        <a:srgbClr val="e8e8e8"/>
       </a:lt2>
       <a:accent1>
         <a:srgbClr val="156082"/>
       </a:accent1>
       <a:accent2>
-        <a:srgbClr val="E97132"/>
+        <a:srgbClr val="e97132"/>
       </a:accent2>
       <a:accent3>
-        <a:srgbClr val="196B24"/>
+        <a:srgbClr val="196b24"/>
       </a:accent3>
       <a:accent4>
-        <a:srgbClr val="0F9ED5"/>
+        <a:srgbClr val="0f9ed5"/>
       </a:accent4>
       <a:accent5>
-        <a:srgbClr val="A02B93"/>
+        <a:srgbClr val="a02b93"/>
       </a:accent5>
       <a:accent6>
-        <a:srgbClr val="4EA72E"/>
+        <a:srgbClr val="4ea72e"/>
       </a:accent6>
       <a:hlink>
         <a:srgbClr val="467886"/>
       </a:hlink>
       <a:folHlink>
-        <a:srgbClr val="96607D"/>
+        <a:srgbClr val="96607d"/>
       </a:folHlink>
     </a:clrScheme>
     <a:fontScheme name="Office">
       <a:majorFont>
-        <a:latin typeface="Aptos Display" panose="02110004020202020204"/>
+        <a:latin typeface="Aptos Display" panose="02110004020202020204" pitchFamily="0" charset="1"/>
         <a:ea typeface=""/>
         <a:cs typeface=""/>
-        <a:font script="Jpan" typeface="游ゴシック Light"/>
-        <a:font script="Hang" typeface="맑은 고딕"/>
-        <a:font script="Hans" typeface="等线 Light"/>
-        <a:font script="Hant" typeface="新細明體"/>
-        <a:font script="Arab" typeface="Times New Roman"/>
-        <a:font script="Hebr" typeface="Times New Roman"/>
-        <a:font script="Thai" typeface="Angsana New"/>
-        <a:font script="Ethi" typeface="Nyala"/>
-        <a:font script="Beng" typeface="Vrinda"/>
-        <a:font script="Gujr" typeface="Shruti"/>
-        <a:font script="Khmr" typeface="MoolBoran"/>
-        <a:font script="Knda" typeface="Tunga"/>
-        <a:font script="Guru" typeface="Raavi"/>
-        <a:font script="Cans" typeface="Euphemia"/>
-        <a:font script="Cher" typeface="Plantagenet Cherokee"/>
-        <a:font script="Yiii" typeface="Microsoft Yi Baiti"/>
-        <a:font script="Tibt" typeface="Microsoft Himalaya"/>
-        <a:font script="Thaa" typeface="MV Boli"/>
-        <a:font script="Deva" typeface="Mangal"/>
-        <a:font script="Telu" typeface="Gautami"/>
-        <a:font script="Taml" typeface="Latha"/>
-        <a:font script="Syrc" typeface="Estrangelo Edessa"/>
-        <a:font script="Orya" typeface="Kalinga"/>
-        <a:font script="Mlym" typeface="Kartika"/>
-        <a:font script="Laoo" typeface="DokChampa"/>
-        <a:font script="Sinh" typeface="Iskoola Pota"/>
-        <a:font script="Mong" typeface="Mongolian Baiti"/>
-        <a:font script="Viet" typeface="Times New Roman"/>
-        <a:font script="Uigh" typeface="Microsoft Uighur"/>
-        <a:font script="Geor" typeface="Sylfaen"/>
-        <a:font script="Armn" typeface="Arial"/>
-        <a:font script="Bugi" typeface="Leelawadee UI"/>
-        <a:font script="Bopo" typeface="Microsoft JhengHei"/>
-        <a:font script="Java" typeface="Javanese Text"/>
-        <a:font script="Lisu" typeface="Segoe UI"/>
-        <a:font script="Mymr" typeface="Myanmar Text"/>
-        <a:font script="Nkoo" typeface="Ebrima"/>
-        <a:font script="Olck" typeface="Nirmala UI"/>
-        <a:font script="Osma" typeface="Ebrima"/>
-        <a:font script="Phag" typeface="Phagspa"/>
-        <a:font script="Syrn" typeface="Estrangelo Edessa"/>
-        <a:font script="Syrj" typeface="Estrangelo Edessa"/>
-        <a:font script="Syre" typeface="Estrangelo Edessa"/>
-        <a:font script="Sora" typeface="Nirmala UI"/>
-        <a:font script="Tale" typeface="Microsoft Tai Le"/>
-        <a:font script="Talu" typeface="Microsoft New Tai Lue"/>
-        <a:font script="Tfng" typeface="Ebrima"/>
       </a:majorFont>
       <a:minorFont>
-        <a:latin typeface="Aptos" panose="02110004020202020204"/>
+        <a:latin typeface="Aptos" panose="02110004020202020204" pitchFamily="0" charset="1"/>
         <a:ea typeface=""/>
         <a:cs typeface=""/>
-        <a:font script="Jpan" typeface="游明朝"/>
-        <a:font script="Hang" typeface="맑은 고딕"/>
-        <a:font script="Hans" typeface="等线"/>
-        <a:font script="Hant" typeface="新細明體"/>
-        <a:font script="Arab" typeface="Arial"/>
-        <a:font script="Hebr" typeface="Arial"/>
-        <a:font script="Thai" typeface="Cordia New"/>
-        <a:font script="Ethi" typeface="Nyala"/>
-        <a:font script="Beng" typeface="Vrinda"/>
-        <a:font script="Gujr" typeface="Shruti"/>
-        <a:font script="Khmr" typeface="DaunPenh"/>
-        <a:font script="Knda" typeface="Tunga"/>
-        <a:font script="Guru" typeface="Raavi"/>
-        <a:font script="Cans" typeface="Euphemia"/>
-        <a:font script="Cher" typeface="Plantagenet Cherokee"/>
-        <a:font script="Yiii" typeface="Microsoft Yi Baiti"/>
-        <a:font script="Tibt" typeface="Microsoft Himalaya"/>
-        <a:font script="Thaa" typeface="MV Boli"/>
-        <a:font script="Deva" typeface="Mangal"/>
-        <a:font script="Telu" typeface="Gautami"/>
-        <a:font script="Taml" typeface="Latha"/>
-        <a:font script="Syrc" typeface="Estrangelo Edessa"/>
-        <a:font script="Orya" typeface="Kalinga"/>
-        <a:font script="Mlym" typeface="Kartika"/>
-        <a:font script="Laoo" typeface="DokChampa"/>
-        <a:font script="Sinh" typeface="Iskoola Pota"/>
-        <a:font script="Mong" typeface="Mongolian Baiti"/>
-        <a:font script="Viet" typeface="Arial"/>
-        <a:font script="Uigh" typeface="Microsoft Uighur"/>
-        <a:font script="Geor" typeface="Sylfaen"/>
-        <a:font script="Armn" typeface="Arial"/>
-        <a:font script="Bugi" typeface="Leelawadee UI"/>
-        <a:font script="Bopo" typeface="Microsoft JhengHei"/>
-        <a:font script="Java" typeface="Javanese Text"/>
-        <a:font script="Lisu" typeface="Segoe UI"/>
-        <a:font script="Mymr" typeface="Myanmar Text"/>
-        <a:font script="Nkoo" typeface="Ebrima"/>
-        <a:font script="Olck" typeface="Nirmala UI"/>
-        <a:font script="Osma" typeface="Ebrima"/>
-        <a:font script="Phag" typeface="Phagspa"/>
-        <a:font script="Syrn" typeface="Estrangelo Edessa"/>
-        <a:font script="Syrj" typeface="Estrangelo Edessa"/>
-        <a:font script="Syre" typeface="Estrangelo Edessa"/>
-        <a:font script="Sora" typeface="Nirmala UI"/>
-        <a:font script="Tale" typeface="Microsoft Tai Le"/>
-        <a:font script="Talu" typeface="Microsoft New Tai Lue"/>
-        <a:font script="Tfng" typeface="Ebrima"/>
       </a:minorFont>
     </a:fontScheme>
-    <a:fmtScheme name="Office">
+    <a:fmtScheme>
       <a:fillStyleLst>
         <a:solidFill>
           <a:schemeClr val="phClr"/>
         </a:solidFill>
-        <a:gradFill rotWithShape="1">
+        <a:gradFill>
           <a:gsLst>
             <a:gs pos="0">
               <a:schemeClr val="phClr">
                 <a:lumMod val="110000"/>
-                <a:satMod val="105000"/>
                 <a:tint val="67000"/>
               </a:schemeClr>
             </a:gs>
             <a:gs pos="50000">
               <a:schemeClr val="phClr">
                 <a:lumMod val="105000"/>
-                <a:satMod val="103000"/>
                 <a:tint val="73000"/>
               </a:schemeClr>
             </a:gs>
             <a:gs pos="100000">
               <a:schemeClr val="phClr">
                 <a:lumMod val="105000"/>
-                <a:satMod val="109000"/>
                 <a:tint val="81000"/>
               </a:schemeClr>
             </a:gs>
           </a:gsLst>
           <a:lin ang="5400000" scaled="0"/>
+          <a:tileRect l="0" t="0" r="0" b="0"/>
         </a:gradFill>
-        <a:gradFill rotWithShape="1">
+        <a:gradFill>
           <a:gsLst>
             <a:gs pos="0">
               <a:schemeClr val="phClr">
-                <a:satMod val="103000"/>
                 <a:lumMod val="102000"/>
                 <a:tint val="94000"/>
               </a:schemeClr>
             </a:gs>
             <a:gs pos="50000">
               <a:schemeClr val="phClr">
-                <a:satMod val="110000"/>
                 <a:lumMod val="100000"/>
                 <a:shade val="100000"/>
               </a:schemeClr>
@@ -1526,33 +2488,24 @@
             <a:gs pos="100000">
               <a:schemeClr val="phClr">
                 <a:lumMod val="99000"/>
-                <a:satMod val="120000"/>
                 <a:shade val="78000"/>
               </a:schemeClr>
             </a:gs>
           </a:gsLst>
           <a:lin ang="5400000" scaled="0"/>
+          <a:tileRect l="0" t="0" r="0" b="0"/>
         </a:gradFill>
       </a:fillStyleLst>
       <a:lnStyleLst>
         <a:ln w="6350" cap="flat" cmpd="sng" algn="ctr">
-          <a:solidFill>
-            <a:schemeClr val="phClr"/>
-          </a:solidFill>
           <a:prstDash val="solid"/>
           <a:miter lim="800000"/>
         </a:ln>
         <a:ln w="12700" cap="flat" cmpd="sng" algn="ctr">
-          <a:solidFill>
-            <a:schemeClr val="phClr"/>
-          </a:solidFill>
           <a:prstDash val="solid"/>
           <a:miter lim="800000"/>
         </a:ln>
         <a:ln w="19050" cap="flat" cmpd="sng" algn="ctr">
-          <a:solidFill>
-            <a:schemeClr val="phClr"/>
-          </a:solidFill>
           <a:prstDash val="solid"/>
           <a:miter lim="800000"/>
         </a:ln>
@@ -1565,13 +2518,7 @@
           <a:effectLst/>
         </a:effectStyle>
         <a:effectStyle>
-          <a:effectLst>
-            <a:outerShdw blurRad="57150" dist="19050" dir="5400000" algn="ctr" rotWithShape="0">
-              <a:srgbClr val="000000">
-                <a:alpha val="63000"/>
-              </a:srgbClr>
-            </a:outerShdw>
-          </a:effectLst>
+          <a:effectLst/>
         </a:effectStyle>
       </a:effectStyleLst>
       <a:bgFillStyleLst>
@@ -1581,15 +2528,13 @@
         <a:solidFill>
           <a:schemeClr val="phClr">
             <a:tint val="95000"/>
-            <a:satMod val="170000"/>
           </a:schemeClr>
         </a:solidFill>
-        <a:gradFill rotWithShape="1">
+        <a:gradFill>
           <a:gsLst>
             <a:gs pos="0">
               <a:schemeClr val="phClr">
                 <a:tint val="93000"/>
-                <a:satMod val="150000"/>
                 <a:shade val="98000"/>
                 <a:lumMod val="102000"/>
               </a:schemeClr>
@@ -1597,7 +2542,6 @@
             <a:gs pos="50000">
               <a:schemeClr val="phClr">
                 <a:tint val="98000"/>
-                <a:satMod val="130000"/>
                 <a:shade val="90000"/>
                 <a:lumMod val="103000"/>
               </a:schemeClr>
@@ -1605,21 +2549,14 @@
             <a:gs pos="100000">
               <a:schemeClr val="phClr">
                 <a:shade val="63000"/>
-                <a:satMod val="120000"/>
               </a:schemeClr>
             </a:gs>
           </a:gsLst>
           <a:lin ang="5400000" scaled="0"/>
+          <a:tileRect l="0" t="0" r="0" b="0"/>
         </a:gradFill>
       </a:bgFillStyleLst>
     </a:fmtScheme>
   </a:themeElements>
-  <a:objectDefaults/>
-  <a:extraClrSchemeLst/>
-  <a:extLst>
-    <a:ext uri="{05A4C25C-085E-4340-85A3-A5531E510DB2}">
-      <thm15:themeFamily xmlns:thm15="http://schemas.microsoft.com/office/thememl/2012/main" name="Office Theme" id="{2E142A2C-CD16-42D6-873A-C26D2A0506FA}" vid="{1BDDFF52-6CD6-40A5-AB3C-68EB2F1E4D0A}"/>
-    </a:ext>
-  </a:extLst>
 </a:theme>
 </file>
</xml_diff>